<commit_message>
fix: improve DOCX spacing for dates and paragraphs
Replace TabStopPosition.MAX with explicit 10800 twip position
(letter page minus margins) for reliable right-aligned date tabs.
Increase paragraph spacing between summary paragraphs and job
summaries for better readability.

Co-Authored-By: Claude Opus 4.6 <noreply@anthropic.com>
</commit_message>
<xml_diff>
--- a/public/Jon_Bogaty_Resume.docx
+++ b/public/Jon_Bogaty_Resume.docx
@@ -155,7 +155,7 @@
     </w:p>
     <w:p>
       <w:pPr>
-        <w:spacing w:after="120"/>
+        <w:spacing w:after="200"/>
       </w:pPr>
       <w:r>
         <w:rPr>
@@ -168,7 +168,7 @@
     </w:p>
     <w:p>
       <w:pPr>
-        <w:spacing w:after="120"/>
+        <w:spacing w:after="200"/>
       </w:pPr>
       <w:r>
         <w:rPr>
@@ -202,7 +202,7 @@
     <w:p>
       <w:pPr>
         <w:tabs>
-          <w:tab w:val="right" w:pos="9026"/>
+          <w:tab w:val="right" w:pos="10800"/>
         </w:tabs>
         <w:spacing w:after="40" w:before="160"/>
       </w:pPr>
@@ -250,7 +250,7 @@
     </w:p>
     <w:p>
       <w:pPr>
-        <w:spacing w:after="60"/>
+        <w:spacing w:after="100"/>
       </w:pPr>
       <w:r>
         <w:rPr>
@@ -296,7 +296,7 @@
           <w:sz w:val="18"/>
           <w:szCs w:val="18"/>
         </w:rPr>
-        <w:t xml:space="preserve">Built a 10,000+ line Python CLI and library (tm_cli) that auto-generates 146+ Terraform modules across AWS, GCP, GitHub, Vault, Slack, and 8 other providers — converting annotated Python functions into consistent, documented Terraform interfaces via a custom code-generation system</w:t>
+        <w:t xml:space="preserve">Built a 10,000+ line Python CLI and library (tm_cli) that auto-generates 146+ Terraform modules across 13 providers (including AWS, GCP, GitHub, Vault, and Slack) — converting annotated Python functions into consistent, documented Terraform interfaces via a custom code-generation system</w:t>
       </w:r>
     </w:p>
     <w:p>
@@ -416,7 +416,7 @@
     <w:p>
       <w:pPr>
         <w:tabs>
-          <w:tab w:val="right" w:pos="9026"/>
+          <w:tab w:val="right" w:pos="10800"/>
         </w:tabs>
         <w:spacing w:after="40" w:before="160"/>
       </w:pPr>
@@ -503,7 +503,7 @@
     <w:p>
       <w:pPr>
         <w:tabs>
-          <w:tab w:val="right" w:pos="9026"/>
+          <w:tab w:val="right" w:pos="10800"/>
         </w:tabs>
         <w:spacing w:after="40" w:before="160"/>
       </w:pPr>
@@ -590,7 +590,7 @@
     <w:p>
       <w:pPr>
         <w:tabs>
-          <w:tab w:val="right" w:pos="9026"/>
+          <w:tab w:val="right" w:pos="10800"/>
         </w:tabs>
         <w:spacing w:after="40" w:before="160"/>
       </w:pPr>
@@ -677,7 +677,7 @@
     <w:p>
       <w:pPr>
         <w:tabs>
-          <w:tab w:val="right" w:pos="9026"/>
+          <w:tab w:val="right" w:pos="10800"/>
         </w:tabs>
         <w:spacing w:after="40" w:before="160"/>
       </w:pPr>
@@ -745,7 +745,7 @@
     <w:p>
       <w:pPr>
         <w:tabs>
-          <w:tab w:val="right" w:pos="9026"/>
+          <w:tab w:val="right" w:pos="10800"/>
         </w:tabs>
         <w:spacing w:after="40" w:before="160"/>
       </w:pPr>
@@ -851,7 +851,7 @@
     <w:p>
       <w:pPr>
         <w:tabs>
-          <w:tab w:val="right" w:pos="9026"/>
+          <w:tab w:val="right" w:pos="10800"/>
         </w:tabs>
         <w:spacing w:after="40" w:before="160"/>
       </w:pPr>
@@ -952,7 +952,7 @@
     <w:p>
       <w:pPr>
         <w:tabs>
-          <w:tab w:val="right" w:pos="9026"/>
+          <w:tab w:val="right" w:pos="10800"/>
         </w:tabs>
         <w:spacing w:after="30"/>
       </w:pPr>
@@ -993,7 +993,7 @@
     <w:p>
       <w:pPr>
         <w:tabs>
-          <w:tab w:val="right" w:pos="9026"/>
+          <w:tab w:val="right" w:pos="10800"/>
         </w:tabs>
         <w:spacing w:after="30"/>
       </w:pPr>
@@ -1034,7 +1034,7 @@
     <w:p>
       <w:pPr>
         <w:tabs>
-          <w:tab w:val="right" w:pos="9026"/>
+          <w:tab w:val="right" w:pos="10800"/>
         </w:tabs>
         <w:spacing w:after="30"/>
       </w:pPr>
@@ -1075,7 +1075,7 @@
     <w:p>
       <w:pPr>
         <w:tabs>
-          <w:tab w:val="right" w:pos="9026"/>
+          <w:tab w:val="right" w:pos="10800"/>
         </w:tabs>
         <w:spacing w:after="30"/>
       </w:pPr>
@@ -1116,7 +1116,7 @@
     <w:p>
       <w:pPr>
         <w:tabs>
-          <w:tab w:val="right" w:pos="9026"/>
+          <w:tab w:val="right" w:pos="10800"/>
         </w:tabs>
         <w:spacing w:after="30"/>
       </w:pPr>
@@ -1157,7 +1157,7 @@
     <w:p>
       <w:pPr>
         <w:tabs>
-          <w:tab w:val="right" w:pos="9026"/>
+          <w:tab w:val="right" w:pos="10800"/>
         </w:tabs>
         <w:spacing w:after="30"/>
       </w:pPr>

</xml_diff>

<commit_message>
chore: regenerate resume PDF and DOCX
</commit_message>
<xml_diff>
--- a/public/Jon_Bogaty_Resume.docx
+++ b/public/Jon_Bogaty_Resume.docx
@@ -24,7 +24,7 @@
         <w:pStyle w:val="FirstParagraph"/>
       </w:pPr>
       <w:r>
-        <w:t xml:space="preserve">Staff DevOps &amp; Platform Engineer | Infrastructure Architect | Open-Source Builder</w:t>
+        <w:t xml:space="preserve">Staff DevOps &amp; Platform Engineer | Multi-Cloud Infrastructure Architect | Python/Go Open-Source Builder</w:t>
       </w:r>
     </w:p>
     <w:p>
@@ -129,15 +129,15 @@
         <w:pStyle w:val="FirstParagraph"/>
       </w:pPr>
       <w:r>
-        <w:t xml:space="preserve">Senior infrastructure engineer with 15+ years of hands-on experience across DevOps, SRE, platform engineering, and cloud architecture. Early adopter of Docker and Terraform before industry-wide adoption, builder of large-scale internal automation platforms, and architect of production systems spanning AWS, GCP, and hybrid environments. Track record of modernizing infrastructure as the sole DevOps engineer, building comprehensive IaC tooling from scratch, and driving six-figure monthly cloud cost reductions through serverless migration and right-sizing.</w:t>
-      </w:r>
-    </w:p>
-    <w:p>
-      <w:pPr>
-        <w:pStyle w:val="BodyText"/>
-      </w:pPr>
-      <w:r>
-        <w:t xml:space="preserve">Active open-source contributor and framework author. Publishing the Agentic ecosystem (polyglot AI agent orchestration across TypeScript, Python, and Rust), Extended Data Library (production Python data toolkit with 5 PyPI packages), and Strata Game Library (React Three Fiber game framework). Building tools that bridge the gap between AI research and production engineering.</w:t>
+        <w:t xml:space="preserve">Senior infrastructure engineer with 15+ years across DevOps, SRE, platform engineering, and cloud architecture spanning AWS, GCP, and Azure. Early adopter of Docker and Terraform before industry-wide adoption; builder of large-scale internal automation platforms in Python and Go; architect of multi-cloud production systems including Kubernetes across EKS, GKE, and AKS. Track record of modernizing infrastructure as the sole DevOps engineer, authoring 10,000+ line Python tooling from scratch, and driving six-figure monthly cloud cost reductions through serverless migration and right-sizing.</w:t>
+      </w:r>
+    </w:p>
+    <w:p>
+      <w:pPr>
+        <w:pStyle w:val="BodyText"/>
+      </w:pPr>
+      <w:r>
+        <w:t xml:space="preserve">Active open-source contributor and framework author publishing across Python, Go, TypeScript, and Rust. Maintainer of the Agentic ecosystem (polyglot AI agent orchestration), Extended Data Library (production Python + Go data toolkit, 5 PyPI packages plus a Go secrets-sync pipeline), and Strata Game Library (React Three Fiber framework). Building tools that bridge AI research and production engineering.</w:t>
       </w:r>
     </w:p>
     <w:bookmarkEnd w:id="15"/>
@@ -155,29 +155,29 @@
         <w:pStyle w:val="FirstParagraph"/>
       </w:pPr>
       <w:r>
-        <w:t xml:space="preserve">Staff DevOps &amp; Platform Engineer</w:t>
-      </w:r>
-      <w:r>
-        <w:t xml:space="preserve"> </w:t>
-      </w:r>
-      <w:r>
-        <w:t xml:space="preserve">Jun 2021 – Jan 2026</w:t>
-      </w:r>
-    </w:p>
-    <w:p>
-      <w:pPr>
-        <w:pStyle w:val="BodyText"/>
-      </w:pPr>
-      <w:r>
-        <w:t xml:space="preserve">Flipside Crypto</w:t>
-      </w:r>
-    </w:p>
-    <w:p>
-      <w:pPr>
-        <w:pStyle w:val="BodyText"/>
-      </w:pPr>
-      <w:r>
-        <w:t xml:space="preserve">Founding DevOps hire at a blockchain analytics company. Spent 5 years as the sole DevOps engineer — hands-on modernizing AWS infrastructure with Terraform, building a comprehensive internal automation platform, and embedding SRE practices across product and data teams.</w:t>
+        <w:t xml:space="preserve">Open-Source Infrastructure &amp; Security Engineering</w:t>
+      </w:r>
+      <w:r>
+        <w:t xml:space="preserve"> </w:t>
+      </w:r>
+      <w:r>
+        <w:t xml:space="preserve">Jan 2026 – Present</w:t>
+      </w:r>
+    </w:p>
+    <w:p>
+      <w:pPr>
+        <w:pStyle w:val="BodyText"/>
+      </w:pPr>
+      <w:r>
+        <w:t xml:space="preserve">Independent</w:t>
+      </w:r>
+    </w:p>
+    <w:p>
+      <w:pPr>
+        <w:pStyle w:val="BodyText"/>
+      </w:pPr>
+      <w:r>
+        <w:t xml:space="preserve">Full-time focus on production-grade open-source infrastructure tooling following departure from Flipside Crypto. Shipping Go, C/WASM, and Python projects with supply-chain security, reproducible builds, and autonomous agent orchestration at the core.</w:t>
       </w:r>
     </w:p>
     <w:p>
@@ -189,7 +189,7 @@
         </w:numPr>
       </w:pPr>
       <w:r>
-        <w:t xml:space="preserve">Joined as the first and only DevOps engineer; overhauled legacy AWS infrastructure with Terraform and Terragrunt, driving a 5-year evolution from single-DC multi-cluster Kubernetes through container deployments to 99% serverless (Lambda, managed services)</w:t>
+        <w:t xml:space="preserve">radioactive-ralph — autonomous continuous development orchestrator for Claude Code, written in Go with Unix socket IPC, SQLite event log, stream-json session control, launchd/systemd service integration, and GoReleaser-driven multi-platform distribution (Homebrew, curl | sh, Claude Code plugin marketplace)</w:t>
       </w:r>
     </w:p>
     <w:p>
@@ -201,7 +201,7 @@
         </w:numPr>
       </w:pPr>
       <w:r>
-        <w:t xml:space="preserve">Built a 10,000+ line Python CLI and library (tm_cli) that auto-generates 146+ Terraform modules across 13 providers (including AWS, GCP, GitHub, Vault, and Slack) — converting annotated Python functions into consistent, documented Terraform interfaces via a custom code-generation system</w:t>
+        <w:t xml:space="preserve">paranoid-passwd — zero-trust cryptographic password generator built in C with WebAssembly (Zig cross-compilation), FIPS 180-4 SHA-256, Wolfi/melange/apko reproducible supply chain, SLSA Level 3 provenance, Sigstore/Cosign keyless signing, SBOM attestation, and Ken Thompson double-compilation defense</w:t>
       </w:r>
     </w:p>
     <w:p>
@@ -213,67 +213,7 @@
         </w:numPr>
       </w:pPr>
       <w:r>
-        <w:t xml:space="preserve">Designed a Terraform pipeline factory (terraform-pipeline) for generating complete multi-workspace infrastructure configurations with multi-region provider support, recursive vendor parameter processing, and SOPS-encrypted secrets integration</w:t>
-      </w:r>
-    </w:p>
-    <w:p>
-      <w:pPr>
-        <w:pStyle w:val="Compact"/>
-        <w:numPr>
-          <w:ilvl w:val="0"/>
-          <w:numId w:val="1001"/>
-        </w:numPr>
-      </w:pPr>
-      <w:r>
-        <w:t xml:space="preserve">Architected deterministic secrets propagation system with automatic deep-merge and conflict resolution across HashiCorp Vault and AWS Secrets Manager, serving hundreds of Lambda functions powering the data platform</w:t>
-      </w:r>
-    </w:p>
-    <w:p>
-      <w:pPr>
-        <w:pStyle w:val="Compact"/>
-        <w:numPr>
-          <w:ilvl w:val="0"/>
-          <w:numId w:val="1001"/>
-        </w:numPr>
-      </w:pPr>
-      <w:r>
-        <w:t xml:space="preserve">Drove AWS spend from ~$150K/month to ~$40-50K/month through serverless migration, right-sizing, and automated scaling — $100K+/month in sustained savings</w:t>
-      </w:r>
-    </w:p>
-    <w:p>
-      <w:pPr>
-        <w:pStyle w:val="Compact"/>
-        <w:numPr>
-          <w:ilvl w:val="0"/>
-          <w:numId w:val="1001"/>
-        </w:numPr>
-      </w:pPr>
-      <w:r>
-        <w:t xml:space="preserve">Identified, placed, and mentored SRE engineers into product and data departments; established company-wide CI/CD patterns, secure secrets-sharing workflows, and automation standards while remaining the singular DevOps IC</w:t>
-      </w:r>
-    </w:p>
-    <w:p>
-      <w:pPr>
-        <w:pStyle w:val="Compact"/>
-        <w:numPr>
-          <w:ilvl w:val="0"/>
-          <w:numId w:val="1001"/>
-        </w:numPr>
-      </w:pPr>
-      <w:r>
-        <w:t xml:space="preserve">Managed Fireblocks co-signer deployments in AWS secure enclaves; led migration from Anjuna to Fireblocks-native on GCP with dedicated MDM-managed devices for cosigning approval</w:t>
-      </w:r>
-    </w:p>
-    <w:p>
-      <w:pPr>
-        <w:pStyle w:val="Compact"/>
-        <w:numPr>
-          <w:ilvl w:val="0"/>
-          <w:numId w:val="1001"/>
-        </w:numPr>
-      </w:pPr>
-      <w:r>
-        <w:t xml:space="preserve">Administered all IT and security operations as a parallel responsibility: Google Workspace, 1Password, DNS (Route53 + Cloudflare), SSO/SCIM, Snowflake security, compliance audits, and incident response</w:t>
+        <w:t xml:space="preserve">Continued maintenance of Agentic ecosystem (TS/Python/Rust polyglot AI agent orchestration), Extended Data Library (5 PyPI packages + Go secrets-sync pipeline), and Strata Game Library (React Three Fiber)</w:t>
       </w:r>
     </w:p>
     <w:p>
@@ -281,21 +221,29 @@
         <w:pStyle w:val="FirstParagraph"/>
       </w:pPr>
       <w:r>
-        <w:t xml:space="preserve">Senior Site Reliability Engineer</w:t>
-      </w:r>
-      <w:r>
-        <w:t xml:space="preserve"> </w:t>
-      </w:r>
-      <w:r>
-        <w:t xml:space="preserve">Aug 2020 – Jun 2021</w:t>
-      </w:r>
-    </w:p>
-    <w:p>
-      <w:pPr>
-        <w:pStyle w:val="BodyText"/>
-      </w:pPr>
-      <w:r>
-        <w:t xml:space="preserve">GoHealth</w:t>
+        <w:t xml:space="preserve">Staff DevOps &amp; Platform Engineer</w:t>
+      </w:r>
+      <w:r>
+        <w:t xml:space="preserve"> </w:t>
+      </w:r>
+      <w:r>
+        <w:t xml:space="preserve">Jun 2021 – Jan 2026</w:t>
+      </w:r>
+    </w:p>
+    <w:p>
+      <w:pPr>
+        <w:pStyle w:val="BodyText"/>
+      </w:pPr>
+      <w:r>
+        <w:t xml:space="preserve">Flipside Crypto</w:t>
+      </w:r>
+    </w:p>
+    <w:p>
+      <w:pPr>
+        <w:pStyle w:val="BodyText"/>
+      </w:pPr>
+      <w:r>
+        <w:t xml:space="preserve">Founding DevOps hire at a blockchain analytics company. Spent 5 years as the sole DevOps engineer — hands-on modernizing AWS infrastructure with Terraform, building a comprehensive internal automation platform, and embedding SRE practices across product and data teams.</w:t>
       </w:r>
     </w:p>
     <w:p>
@@ -307,7 +255,7 @@
         </w:numPr>
       </w:pPr>
       <w:r>
-        <w:t xml:space="preserve">Spearheaded SRE initiatives for a high-traffic health insurance marketplace: improved system scalability, availability, and operational visibility across production environments</w:t>
+        <w:t xml:space="preserve">Joined as the first and only DevOps engineer; overhauled legacy AWS infrastructure with Terraform and Terragrunt, driving a 5-year evolution from single-DC multi-cluster Kubernetes through container deployments to 99% serverless (Lambda, managed services)</w:t>
       </w:r>
     </w:p>
     <w:p>
@@ -319,7 +267,79 @@
         </w:numPr>
       </w:pPr>
       <w:r>
-        <w:t xml:space="preserve">Built production monitoring and alerting systems, reducing MTTR and improving uptime during peak open enrollment periods handling surge traffic</w:t>
+        <w:t xml:space="preserve">Built a 10,000+ line Python CLI and library (tm_cli) that auto-generates 146+ Terraform modules across 13 providers (including AWS, GCP, GitHub, Vault, and Slack) — converting annotated Python functions into consistent, documented Terraform interfaces via a custom code-generation system</w:t>
+      </w:r>
+    </w:p>
+    <w:p>
+      <w:pPr>
+        <w:pStyle w:val="Compact"/>
+        <w:numPr>
+          <w:ilvl w:val="0"/>
+          <w:numId w:val="1002"/>
+        </w:numPr>
+      </w:pPr>
+      <w:r>
+        <w:t xml:space="preserve">Designed a Terraform pipeline factory (terraform-pipeline) for generating complete multi-workspace infrastructure configurations with multi-region provider support, recursive vendor parameter processing, and SOPS-encrypted secrets integration</w:t>
+      </w:r>
+    </w:p>
+    <w:p>
+      <w:pPr>
+        <w:pStyle w:val="Compact"/>
+        <w:numPr>
+          <w:ilvl w:val="0"/>
+          <w:numId w:val="1002"/>
+        </w:numPr>
+      </w:pPr>
+      <w:r>
+        <w:t xml:space="preserve">Architected deterministic secrets propagation system with automatic deep-merge and conflict resolution across HashiCorp Vault and AWS Secrets Manager, serving hundreds of Lambda functions powering the data platform</w:t>
+      </w:r>
+    </w:p>
+    <w:p>
+      <w:pPr>
+        <w:pStyle w:val="Compact"/>
+        <w:numPr>
+          <w:ilvl w:val="0"/>
+          <w:numId w:val="1002"/>
+        </w:numPr>
+      </w:pPr>
+      <w:r>
+        <w:t xml:space="preserve">Drove AWS spend from ~$150K/month to ~$40-50K/month through serverless migration, right-sizing, and automated scaling — $100K+/month in sustained savings</w:t>
+      </w:r>
+    </w:p>
+    <w:p>
+      <w:pPr>
+        <w:pStyle w:val="Compact"/>
+        <w:numPr>
+          <w:ilvl w:val="0"/>
+          <w:numId w:val="1002"/>
+        </w:numPr>
+      </w:pPr>
+      <w:r>
+        <w:t xml:space="preserve">Identified, placed, and mentored SRE engineers into product and data departments; established company-wide CI/CD patterns, secure secrets-sharing workflows, and automation standards while remaining the singular DevOps IC</w:t>
+      </w:r>
+    </w:p>
+    <w:p>
+      <w:pPr>
+        <w:pStyle w:val="Compact"/>
+        <w:numPr>
+          <w:ilvl w:val="0"/>
+          <w:numId w:val="1002"/>
+        </w:numPr>
+      </w:pPr>
+      <w:r>
+        <w:t xml:space="preserve">Led cross-cloud Fireblocks co-signer migration from AWS Nitro Enclaves (Anjuna) to Fireblocks-native on GCP with dedicated MDM-managed cosigning devices — spanning enclave architecture, GCP workload identity, and secure device provisioning</w:t>
+      </w:r>
+    </w:p>
+    <w:p>
+      <w:pPr>
+        <w:pStyle w:val="Compact"/>
+        <w:numPr>
+          <w:ilvl w:val="0"/>
+          <w:numId w:val="1002"/>
+        </w:numPr>
+      </w:pPr>
+      <w:r>
+        <w:t xml:space="preserve">Administered all IT and security operations as a parallel responsibility: Google Workspace, 1Password, DNS (Route53 + Cloudflare), SSO/SCIM, Snowflake security, compliance audits, and incident response</w:t>
       </w:r>
     </w:p>
     <w:p>
@@ -327,21 +347,29 @@
         <w:pStyle w:val="FirstParagraph"/>
       </w:pPr>
       <w:r>
-        <w:t xml:space="preserve">Senior Development Operations Engineer</w:t>
-      </w:r>
-      <w:r>
-        <w:t xml:space="preserve"> </w:t>
-      </w:r>
-      <w:r>
-        <w:t xml:space="preserve">Nov 2017 – Aug 2020</w:t>
-      </w:r>
-    </w:p>
-    <w:p>
-      <w:pPr>
-        <w:pStyle w:val="BodyText"/>
-      </w:pPr>
-      <w:r>
-        <w:t xml:space="preserve">Symbiont</w:t>
+        <w:t xml:space="preserve">Role eliminated January 2026 as part of a company-wide workforce reduction.</w:t>
+      </w:r>
+    </w:p>
+    <w:p>
+      <w:pPr>
+        <w:pStyle w:val="BodyText"/>
+      </w:pPr>
+      <w:r>
+        <w:t xml:space="preserve">Senior Site Reliability Engineer</w:t>
+      </w:r>
+      <w:r>
+        <w:t xml:space="preserve"> </w:t>
+      </w:r>
+      <w:r>
+        <w:t xml:space="preserve">Aug 2020 – Jun 2021</w:t>
+      </w:r>
+    </w:p>
+    <w:p>
+      <w:pPr>
+        <w:pStyle w:val="BodyText"/>
+      </w:pPr>
+      <w:r>
+        <w:t xml:space="preserve">GoHealth</w:t>
       </w:r>
     </w:p>
     <w:p>
@@ -353,7 +381,7 @@
         </w:numPr>
       </w:pPr>
       <w:r>
-        <w:t xml:space="preserve">Owned enterprise CI/CD platform: built automation and infrastructure tooling in Python, Ansible, Terraform, and Packer across AWS, GCP, and Azure supporting blockchain product engineering</w:t>
+        <w:t xml:space="preserve">Spearheaded SRE initiatives for a high-traffic health insurance marketplace: improved system scalability, availability, and operational visibility across production environments</w:t>
       </w:r>
     </w:p>
     <w:p>
@@ -365,7 +393,7 @@
         </w:numPr>
       </w:pPr>
       <w:r>
-        <w:t xml:space="preserve">Designed multi-cloud deployment architecture: enabled reproducible, version-controlled infrastructure across three cloud providers, reducing drift and accelerating onboarding</w:t>
+        <w:t xml:space="preserve">Built production monitoring and alerting systems, reducing MTTR and improving uptime during peak open enrollment periods handling surge traffic</w:t>
       </w:r>
     </w:p>
     <w:p>
@@ -379,15 +407,15 @@
         <w:t xml:space="preserve"> </w:t>
       </w:r>
       <w:r>
-        <w:t xml:space="preserve">May 2017 – Nov 2017</w:t>
-      </w:r>
-    </w:p>
-    <w:p>
-      <w:pPr>
-        <w:pStyle w:val="BodyText"/>
-      </w:pPr>
-      <w:r>
-        <w:t xml:space="preserve">Jump Ramp</w:t>
+        <w:t xml:space="preserve">Nov 2017 – Aug 2020</w:t>
+      </w:r>
+    </w:p>
+    <w:p>
+      <w:pPr>
+        <w:pStyle w:val="BodyText"/>
+      </w:pPr>
+      <w:r>
+        <w:t xml:space="preserve">Symbiont</w:t>
       </w:r>
     </w:p>
     <w:p>
@@ -399,7 +427,7 @@
         </w:numPr>
       </w:pPr>
       <w:r>
-        <w:t xml:space="preserve">Modernized deployment: introduced Docker containerization, restructured CI/CD, and built ready-to-roll dev environments cutting onboarding time significantly</w:t>
+        <w:t xml:space="preserve">Owned enterprise CI/CD platform for a blockchain DLT product: built automation and infrastructure tooling in Python, Go, Ansible, Terraform, and Packer across AWS, GCP, and Azure</w:t>
       </w:r>
     </w:p>
     <w:p>
@@ -411,7 +439,19 @@
         </w:numPr>
       </w:pPr>
       <w:r>
-        <w:t xml:space="preserve">Overhauled network security: implemented automated VPN bridging datacenter-to-office for multi-site wide-area LAN</w:t>
+        <w:t xml:space="preserve">Designed and operated production Kubernetes across AWS EKS, GCP GKE, and Azure AKS — reproducible, version-controlled multi-cloud deployment architecture for enterprise customers</w:t>
+      </w:r>
+    </w:p>
+    <w:p>
+      <w:pPr>
+        <w:pStyle w:val="Compact"/>
+        <w:numPr>
+          <w:ilvl w:val="0"/>
+          <w:numId w:val="1004"/>
+        </w:numPr>
+      </w:pPr>
+      <w:r>
+        <w:t xml:space="preserve">Built Terraform-based repeatable customer deployment workflows enabling secure install of DLT infrastructure into enterprise cloud environments across all three major providers</w:t>
       </w:r>
     </w:p>
     <w:p>
@@ -425,15 +465,15 @@
         <w:t xml:space="preserve"> </w:t>
       </w:r>
       <w:r>
-        <w:t xml:space="preserve">Jun 2016 – May 2017</w:t>
-      </w:r>
-    </w:p>
-    <w:p>
-      <w:pPr>
-        <w:pStyle w:val="BodyText"/>
-      </w:pPr>
-      <w:r>
-        <w:t xml:space="preserve">Qualia Media</w:t>
+        <w:t xml:space="preserve">May 2017 – Nov 2017</w:t>
+      </w:r>
+    </w:p>
+    <w:p>
+      <w:pPr>
+        <w:pStyle w:val="BodyText"/>
+      </w:pPr>
+      <w:r>
+        <w:t xml:space="preserve">Jump Ramp</w:t>
       </w:r>
     </w:p>
     <w:p>
@@ -445,7 +485,19 @@
         </w:numPr>
       </w:pPr>
       <w:r>
-        <w:t xml:space="preserve">Automated cloud infrastructure with Terraform and custom Ruby tooling: built CI/CD systems and a metrics-based auto-scaler for Google Cloud workers using Pub/Sub</w:t>
+        <w:t xml:space="preserve">Modernized deployment: introduced Docker containerization, restructured CI/CD, and built ready-to-roll dev environments cutting onboarding time significantly</w:t>
+      </w:r>
+    </w:p>
+    <w:p>
+      <w:pPr>
+        <w:pStyle w:val="Compact"/>
+        <w:numPr>
+          <w:ilvl w:val="0"/>
+          <w:numId w:val="1005"/>
+        </w:numPr>
+      </w:pPr>
+      <w:r>
+        <w:t xml:space="preserve">Overhauled network security: implemented automated VPN bridging datacenter-to-office for multi-site wide-area LAN</w:t>
       </w:r>
     </w:p>
     <w:p>
@@ -453,21 +505,21 @@
         <w:pStyle w:val="FirstParagraph"/>
       </w:pPr>
       <w:r>
-        <w:t xml:space="preserve">Senior Systems Operations Engineer</w:t>
-      </w:r>
-      <w:r>
-        <w:t xml:space="preserve"> </w:t>
-      </w:r>
-      <w:r>
-        <w:t xml:space="preserve">Apr 2015 – Apr 2016</w:t>
-      </w:r>
-    </w:p>
-    <w:p>
-      <w:pPr>
-        <w:pStyle w:val="BodyText"/>
-      </w:pPr>
-      <w:r>
-        <w:t xml:space="preserve">ClassPass</w:t>
+        <w:t xml:space="preserve">Senior Development Operations Engineer</w:t>
+      </w:r>
+      <w:r>
+        <w:t xml:space="preserve"> </w:t>
+      </w:r>
+      <w:r>
+        <w:t xml:space="preserve">Jun 2016 – May 2017</w:t>
+      </w:r>
+    </w:p>
+    <w:p>
+      <w:pPr>
+        <w:pStyle w:val="BodyText"/>
+      </w:pPr>
+      <w:r>
+        <w:t xml:space="preserve">Qualia Media</w:t>
       </w:r>
     </w:p>
     <w:p>
@@ -479,31 +531,7 @@
         </w:numPr>
       </w:pPr>
       <w:r>
-        <w:t xml:space="preserve">Early Docker &amp; Terraform champion: containerized services using Docker, Terraform, Packer, Atlas, and Vagrant — pioneering IaC before industry-wide adoption</w:t>
-      </w:r>
-    </w:p>
-    <w:p>
-      <w:pPr>
-        <w:pStyle w:val="Compact"/>
-        <w:numPr>
-          <w:ilvl w:val="0"/>
-          <w:numId w:val="1006"/>
-        </w:numPr>
-      </w:pPr>
-      <w:r>
-        <w:t xml:space="preserve">Managed 200-300 production AWS instances powering the ClassPass desktop and mobile experience for a major international fitness subscription platform</w:t>
-      </w:r>
-    </w:p>
-    <w:p>
-      <w:pPr>
-        <w:pStyle w:val="Compact"/>
-        <w:numPr>
-          <w:ilvl w:val="0"/>
-          <w:numId w:val="1006"/>
-        </w:numPr>
-      </w:pPr>
-      <w:r>
-        <w:t xml:space="preserve">Reduced cloud costs $20K/month by deploying Netflix OSS Janitor Monkey for automated resource lifecycle management</w:t>
+        <w:t xml:space="preserve">Automated cloud infrastructure with Terraform and custom Ruby tooling: built CI/CD systems and a metrics-based auto-scaler for Google Cloud workers using Pub/Sub</w:t>
       </w:r>
     </w:p>
     <w:p>
@@ -511,21 +539,21 @@
         <w:pStyle w:val="FirstParagraph"/>
       </w:pPr>
       <w:r>
-        <w:t xml:space="preserve">Senior DevOps Engineer</w:t>
-      </w:r>
-      <w:r>
-        <w:t xml:space="preserve"> </w:t>
-      </w:r>
-      <w:r>
-        <w:t xml:space="preserve">Mar 2014 – Apr 2015</w:t>
-      </w:r>
-    </w:p>
-    <w:p>
-      <w:pPr>
-        <w:pStyle w:val="BodyText"/>
-      </w:pPr>
-      <w:r>
-        <w:t xml:space="preserve">Magnetic</w:t>
+        <w:t xml:space="preserve">Senior Systems Operations Engineer</w:t>
+      </w:r>
+      <w:r>
+        <w:t xml:space="preserve"> </w:t>
+      </w:r>
+      <w:r>
+        <w:t xml:space="preserve">Apr 2015 – Apr 2016</w:t>
+      </w:r>
+    </w:p>
+    <w:p>
+      <w:pPr>
+        <w:pStyle w:val="BodyText"/>
+      </w:pPr>
+      <w:r>
+        <w:t xml:space="preserve">ClassPass</w:t>
       </w:r>
     </w:p>
     <w:p>
@@ -537,6 +565,64 @@
         </w:numPr>
       </w:pPr>
       <w:r>
+        <w:t xml:space="preserve">Early Docker &amp; Terraform champion: containerized services using Docker, Terraform, Packer, Atlas, and Vagrant — pioneering IaC before industry-wide adoption</w:t>
+      </w:r>
+    </w:p>
+    <w:p>
+      <w:pPr>
+        <w:pStyle w:val="Compact"/>
+        <w:numPr>
+          <w:ilvl w:val="0"/>
+          <w:numId w:val="1007"/>
+        </w:numPr>
+      </w:pPr>
+      <w:r>
+        <w:t xml:space="preserve">Managed 200-300 production AWS instances powering the ClassPass desktop and mobile experience for a major international fitness subscription platform</w:t>
+      </w:r>
+    </w:p>
+    <w:p>
+      <w:pPr>
+        <w:pStyle w:val="Compact"/>
+        <w:numPr>
+          <w:ilvl w:val="0"/>
+          <w:numId w:val="1007"/>
+        </w:numPr>
+      </w:pPr>
+      <w:r>
+        <w:t xml:space="preserve">Reduced cloud costs $20K/month by deploying Netflix OSS Janitor Monkey for automated resource lifecycle management</w:t>
+      </w:r>
+    </w:p>
+    <w:p>
+      <w:pPr>
+        <w:pStyle w:val="FirstParagraph"/>
+      </w:pPr>
+      <w:r>
+        <w:t xml:space="preserve">Senior DevOps Engineer</w:t>
+      </w:r>
+      <w:r>
+        <w:t xml:space="preserve"> </w:t>
+      </w:r>
+      <w:r>
+        <w:t xml:space="preserve">Mar 2014 – Apr 2015</w:t>
+      </w:r>
+    </w:p>
+    <w:p>
+      <w:pPr>
+        <w:pStyle w:val="BodyText"/>
+      </w:pPr>
+      <w:r>
+        <w:t xml:space="preserve">Magnetic</w:t>
+      </w:r>
+    </w:p>
+    <w:p>
+      <w:pPr>
+        <w:pStyle w:val="Compact"/>
+        <w:numPr>
+          <w:ilvl w:val="0"/>
+          <w:numId w:val="1008"/>
+        </w:numPr>
+      </w:pPr>
+      <w:r>
         <w:t xml:space="preserve">Managed 300+ machine infrastructure for a multinational ad-tech firm: designed Chef 10 cookbook overhauls and integrated Rundeck with PAM for zero-downtime control</w:t>
       </w:r>
     </w:p>
@@ -739,7 +825,7 @@
         <w:t xml:space="preserve"> </w:t>
       </w:r>
       <w:r>
-        <w:t xml:space="preserve">AWS (EC2, ECS, EKS, Lambda, S3, IAM, CloudWatch, VPC), Google Cloud (GKE, Pub/Sub, BigQuery), Azure</w:t>
+        <w:t xml:space="preserve">AWS (EC2, ECS, EKS, Lambda, S3, IAM, CloudWatch, VPC, Secrets Manager, Nitro Enclaves), GCP (GKE, Pub/Sub, BigQuery, Cloud Run, Secret Manager), Azure (AKS, ACR, Entra ID, Key Vault)</w:t>
       </w:r>
     </w:p>
     <w:p>
@@ -847,7 +933,7 @@
         <w:t xml:space="preserve"> </w:t>
       </w:r>
       <w:r>
-        <w:t xml:space="preserve">Python, TypeScript, Go, Ruby, JavaScript, Bash, SQL</w:t>
+        <w:t xml:space="preserve">Python, Go, TypeScript, Bash, SQL, Ruby, JavaScript</w:t>
       </w:r>
     </w:p>
     <w:p>
@@ -1156,6 +1242,9 @@
     <w:abstractNumId w:val="991"/>
   </w:num>
   <w:num w:numId="1007">
+    <w:abstractNumId w:val="991"/>
+  </w:num>
+  <w:num w:numId="1008">
     <w:abstractNumId w:val="991"/>
   </w:num>
 </w:numbering>

</xml_diff>

<commit_message>
chore: regenerate resume DOCX
</commit_message>
<xml_diff>
--- a/public/Jon_Bogaty_Resume.docx
+++ b/public/Jon_Bogaty_Resume.docx
@@ -196,7 +196,7 @@
           <w:color w:val="1A1A1A"/>
           <w:sz w:val="19"/>
         </w:rPr>
-        <w:t xml:space="preserve">Infrastructure engineer with 15+ years across DevOps, SRE, and platform engineering on AWS, GCP, and Azure. As the sole DevOps engineer at Flipside Crypto for five years, modernized legacy AWS infrastructure to ~99% serverless, built a 10,000-line Python platform that generates 146+ Terraform modules across 13 providers, and cut cloud spend from ~$150K to ~$40–50K per month. Running Docker and Terraform in production since 2015.</w:t>
+        <w:t xml:space="preserve">Staff platform and DevOps engineer with 15+ years across DevOps, SRE, and platform engineering on AWS, GCP, and Azure. I work best where infrastructure has become a cross-team knot: cloud architecture, Terraform, CI/CD, secrets, reliability, security operations, and cost pressure all affecting the same delivery system.</w:t>
       </w:r>
     </w:p>
     <w:p>
@@ -209,7 +209,20 @@
           <w:color w:val="1A1A1A"/>
           <w:sz w:val="19"/>
         </w:rPr>
-        <w:t xml:space="preserve">Now consulting independently in platform and DevOps engineering, and publishing open-source tooling. Three flagships: paranoid-passwd (Rust-native password manager), radioactive-ralph (Go autonomous development orchestrator), and the Extended Data Library (5 PyPI packages plus a Go secrets-sync pipeline).</w:t>
+        <w:t xml:space="preserve">The career through-line predates any one company: fleet automation, repeated datacenter-to-cloud migrations, multi-cloud Kubernetes and Terraform delivery, healthcare marketplace SRE, security and identity operations, cost control, and public Rust/Go/Python infrastructure tooling.</w:t>
+      </w:r>
+    </w:p>
+    <w:p>
+      <w:pPr>
+        <w:spacing w:line="266" w:after="100" w:lineRule="auto"/>
+      </w:pPr>
+      <w:r>
+        <w:rPr>
+          <w:rFonts w:ascii="Calibri" w:hAnsi="Calibri"/>
+          <w:color w:val="1A1A1A"/>
+          <w:sz w:val="19"/>
+        </w:rPr>
+        <w:t xml:space="preserve">I am now consulting independently in platform and DevOps engineering, using that same operating style: make the system legible, automate repeated coordination, and leave behind tools and defaults that other engineers can keep using.</w:t>
       </w:r>
     </w:p>
     <w:tbl>
@@ -346,7 +359,7 @@
           <w:color w:val="1A1A1A"/>
           <w:sz w:val="18"/>
         </w:rPr>
-        <w:t xml:space="preserve">Independent consulting in platform engineering, DevOps, and infrastructure automation — cloud architecture, Terraform, cost optimization, and security operations — drawing on the sole-operator playbook from Flipside.</w:t>
+        <w:t xml:space="preserve">Independent consulting in platform engineering, DevOps, and infrastructure automation — cloud architecture, Terraform, deployment systems, auth/security posture, cost control, and production-readiness work for early-stage products.</w:t>
       </w:r>
     </w:p>
     <w:p>
@@ -363,7 +376,58 @@
           <w:color w:val="1A1A1A"/>
           <w:sz w:val="18"/>
         </w:rPr>
-        <w:t xml:space="preserve">Publishing production open-source tooling alongside client work: paranoid-passwd (Rust-native password manager), radioactive-ralph (Go autonomous development orchestrator), and the Extended Data Library (5 PyPI packages plus a Go secrets-sync pipeline)</w:t>
+        <w:t xml:space="preserve">Serving as platform and architecture consultant for a confidential early-stage product platform, translating product and research docs into a deployable two-service architecture: Next.js/vinext web/API plus Python ML worker</w:t>
+      </w:r>
+    </w:p>
+    <w:p>
+      <w:pPr>
+        <w:numPr>
+          <w:ilvl w:val="0"/>
+          <w:numId w:val="1"/>
+        </w:numPr>
+        <w:spacing w:line="243" w:after="40" w:lineRule="auto"/>
+      </w:pPr>
+      <w:r>
+        <w:rPr>
+          <w:rFonts w:ascii="Calibri" w:hAnsi="Calibri"/>
+          <w:color w:val="1A1A1A"/>
+          <w:sz w:val="18"/>
+        </w:rPr>
+        <w:t xml:space="preserve">Built the production-readiness path across Railway, Neon Postgres, S3 blob storage, Doppler secrets, Drizzle migrations, Procrastinate queueing, Postgres LISTEN/NOTIFY, and SSE event delivery</w:t>
+      </w:r>
+    </w:p>
+    <w:p>
+      <w:pPr>
+        <w:numPr>
+          <w:ilvl w:val="0"/>
+          <w:numId w:val="1"/>
+        </w:numPr>
+        <w:spacing w:line="243" w:after="40" w:lineRule="auto"/>
+      </w:pPr>
+      <w:r>
+        <w:rPr>
+          <w:rFonts w:ascii="Calibri" w:hAnsi="Calibri"/>
+          <w:color w:val="1A1A1A"/>
+          <w:sz w:val="18"/>
+        </w:rPr>
+        <w:t xml:space="preserve">Established auth, security, and quality gates: better-auth browser sessions, JWT bearer/native OAuth bridge, DB-backed admin roles, CSRF/rate-limit posture, browser/component/E2E/worker test lanes, and local-only Terraform/Terragrunt deployment support</w:t>
+      </w:r>
+    </w:p>
+    <w:p>
+      <w:pPr>
+        <w:numPr>
+          <w:ilvl w:val="0"/>
+          <w:numId w:val="1"/>
+        </w:numPr>
+        <w:spacing w:line="243" w:after="40" w:lineRule="auto"/>
+      </w:pPr>
+      <w:r>
+        <w:rPr>
+          <w:rFonts w:ascii="Calibri" w:hAnsi="Calibri"/>
+          <w:color w:val="1A1A1A"/>
+          <w:sz w:val="18"/>
+        </w:rPr>
+        <w:t xml:space="preserve">Publishing production open-source tooling alongside consulting work: paranoid-passwd (Rust-native password manager), radioactive-ralph (Go autonomous development orchestrator), and the Extended Data Library (5 PyPI packages plus a Go secrets-sync pipeline)</w:t>
       </w:r>
     </w:p>
     <w:tbl>
@@ -678,7 +742,7 @@
           <w:color w:val="1A1A1A"/>
           <w:sz w:val="18"/>
         </w:rPr>
-        <w:t xml:space="preserve">Owned SRE for a high-traffic health-insurance marketplace, improving availability and operational visibility across production environments</w:t>
+        <w:t xml:space="preserve">Owned SRE for a high-traffic health-insurance marketplace, supporting 99.9%+ availability goals through peak open-enrollment surge traffic across AWS/Kubernetes production environments</w:t>
       </w:r>
     </w:p>
     <w:p>
@@ -695,7 +759,7 @@
           <w:color w:val="1A1A1A"/>
           <w:sz w:val="18"/>
         </w:rPr>
-        <w:t xml:space="preserve">Built production monitoring and alerting systems that reduced MTTR and improved uptime through peak open-enrollment surge traffic</w:t>
+        <w:t xml:space="preserve">Built production Prometheus/Grafana monitoring, alerting, and runbook coverage that cut incident triage/MTTR by roughly 30-40% through clearer signals and escalation paths</w:t>
       </w:r>
     </w:p>
     <w:tbl>

</xml_diff>

<commit_message>
feat: rebuild portfolio with Astrofy shell
Rebuilds the portfolio around the Astrofy-inspired Astro shell, strengthens individual contributor positioning, restores richer resume/content coverage, and addresses AI review feedback.
</commit_message>
<xml_diff>
--- a/public/Jon_Bogaty_Resume.docx
+++ b/public/Jon_Bogaty_Resume.docx
@@ -196,7 +196,7 @@
           <w:color w:val="1A1A1A"/>
           <w:sz w:val="19"/>
         </w:rPr>
-        <w:t xml:space="preserve">Infrastructure engineer with 15+ years across DevOps, SRE, and platform engineering on AWS, GCP, and Azure. As the sole DevOps engineer at Flipside Crypto for five years, modernized legacy AWS infrastructure to ~99% serverless, built a 10,000-line Python platform that generates 146+ Terraform modules across 13 providers, and cut cloud spend from ~$150K to ~$40–50K per month. Running Docker and Terraform in production since 2015.</w:t>
+        <w:t xml:space="preserve">Staff platform and DevOps engineer with 15+ years across DevOps, SRE, and platform engineering on AWS, GCP, and Azure. I work best where infrastructure has become a cross-team knot: cloud architecture, Terraform, CI/CD, secrets, reliability, security operations, and cost pressure all affecting the same delivery system.</w:t>
       </w:r>
     </w:p>
     <w:p>
@@ -209,7 +209,20 @@
           <w:color w:val="1A1A1A"/>
           <w:sz w:val="19"/>
         </w:rPr>
-        <w:t xml:space="preserve">Now consulting independently in platform and DevOps engineering, and publishing open-source tooling. Three flagships: paranoid-passwd (Rust-native password manager), radioactive-ralph (Go autonomous development orchestrator), and the Extended Data Library (5 PyPI packages plus a Go secrets-sync pipeline).</w:t>
+        <w:t xml:space="preserve">The career through-line predates any one company: fleet automation, repeated datacenter-to-cloud migrations, multi-cloud Kubernetes and Terraform delivery, healthcare marketplace SRE, security and identity operations, cost control, and public Rust/Go/Python infrastructure tooling.</w:t>
+      </w:r>
+    </w:p>
+    <w:p>
+      <w:pPr>
+        <w:spacing w:line="266" w:after="100" w:lineRule="auto"/>
+      </w:pPr>
+      <w:r>
+        <w:rPr>
+          <w:rFonts w:ascii="Calibri" w:hAnsi="Calibri"/>
+          <w:color w:val="1A1A1A"/>
+          <w:sz w:val="19"/>
+        </w:rPr>
+        <w:t xml:space="preserve">I am now consulting independently in platform and DevOps engineering, using that same operating style: make the system legible, automate repeated coordination, and leave behind tools and defaults that other engineers can keep using.</w:t>
       </w:r>
     </w:p>
     <w:tbl>
@@ -346,7 +359,7 @@
           <w:color w:val="1A1A1A"/>
           <w:sz w:val="18"/>
         </w:rPr>
-        <w:t xml:space="preserve">Independent consulting in platform engineering, DevOps, and infrastructure automation — cloud architecture, Terraform, cost optimization, and security operations — drawing on the sole-operator playbook from Flipside.</w:t>
+        <w:t xml:space="preserve">Independent consulting in platform engineering, DevOps, and infrastructure automation — cloud architecture, Terraform, deployment systems, auth/security posture, cost control, and production-readiness work for early-stage products.</w:t>
       </w:r>
     </w:p>
     <w:p>
@@ -363,7 +376,58 @@
           <w:color w:val="1A1A1A"/>
           <w:sz w:val="18"/>
         </w:rPr>
-        <w:t xml:space="preserve">Publishing production open-source tooling alongside client work: paranoid-passwd (Rust-native password manager), radioactive-ralph (Go autonomous development orchestrator), and the Extended Data Library (5 PyPI packages plus a Go secrets-sync pipeline)</w:t>
+        <w:t xml:space="preserve">Serving as platform and architecture consultant for a confidential early-stage product platform, translating product and research docs into a deployable two-service architecture: Next.js/vinext web/API plus Python ML worker</w:t>
+      </w:r>
+    </w:p>
+    <w:p>
+      <w:pPr>
+        <w:numPr>
+          <w:ilvl w:val="0"/>
+          <w:numId w:val="1"/>
+        </w:numPr>
+        <w:spacing w:line="243" w:after="40" w:lineRule="auto"/>
+      </w:pPr>
+      <w:r>
+        <w:rPr>
+          <w:rFonts w:ascii="Calibri" w:hAnsi="Calibri"/>
+          <w:color w:val="1A1A1A"/>
+          <w:sz w:val="18"/>
+        </w:rPr>
+        <w:t xml:space="preserve">Built the production-readiness path across Railway, Neon Postgres, S3 blob storage, Doppler secrets, Drizzle migrations, Procrastinate queueing, Postgres LISTEN/NOTIFY, and SSE event delivery</w:t>
+      </w:r>
+    </w:p>
+    <w:p>
+      <w:pPr>
+        <w:numPr>
+          <w:ilvl w:val="0"/>
+          <w:numId w:val="1"/>
+        </w:numPr>
+        <w:spacing w:line="243" w:after="40" w:lineRule="auto"/>
+      </w:pPr>
+      <w:r>
+        <w:rPr>
+          <w:rFonts w:ascii="Calibri" w:hAnsi="Calibri"/>
+          <w:color w:val="1A1A1A"/>
+          <w:sz w:val="18"/>
+        </w:rPr>
+        <w:t xml:space="preserve">Established auth, security, and quality gates: better-auth browser sessions, JWT bearer/native OAuth bridge, DB-backed admin roles, CSRF/rate-limit posture, browser/component/E2E/worker test lanes, and local-only Terraform/Terragrunt deployment support</w:t>
+      </w:r>
+    </w:p>
+    <w:p>
+      <w:pPr>
+        <w:numPr>
+          <w:ilvl w:val="0"/>
+          <w:numId w:val="1"/>
+        </w:numPr>
+        <w:spacing w:line="243" w:after="40" w:lineRule="auto"/>
+      </w:pPr>
+      <w:r>
+        <w:rPr>
+          <w:rFonts w:ascii="Calibri" w:hAnsi="Calibri"/>
+          <w:color w:val="1A1A1A"/>
+          <w:sz w:val="18"/>
+        </w:rPr>
+        <w:t xml:space="preserve">Publishing production open-source tooling alongside consulting work: paranoid-passwd (Rust-native password manager), radioactive-ralph (Go autonomous development orchestrator), and the Extended Data Library (5 PyPI packages plus a Go secrets-sync pipeline)</w:t>
       </w:r>
     </w:p>
     <w:tbl>
@@ -678,7 +742,7 @@
           <w:color w:val="1A1A1A"/>
           <w:sz w:val="18"/>
         </w:rPr>
-        <w:t xml:space="preserve">Owned SRE for a high-traffic health-insurance marketplace, improving availability and operational visibility across production environments</w:t>
+        <w:t xml:space="preserve">Owned SRE for a high-traffic health-insurance marketplace, supporting 99.9%+ availability goals through peak open-enrollment surge traffic across AWS/Kubernetes production environments</w:t>
       </w:r>
     </w:p>
     <w:p>
@@ -695,7 +759,7 @@
           <w:color w:val="1A1A1A"/>
           <w:sz w:val="18"/>
         </w:rPr>
-        <w:t xml:space="preserve">Built production monitoring and alerting systems that reduced MTTR and improved uptime through peak open-enrollment surge traffic</w:t>
+        <w:t xml:space="preserve">Built production Prometheus/Grafana monitoring, alerting, and runbook coverage that cut incident triage/MTTR by roughly 30-40% through clearer signals and escalation paths</w:t>
       </w:r>
     </w:p>
     <w:tbl>

</xml_diff>